<commit_message>
feat(translations): update chapter titles in Turkish translation
</commit_message>
<xml_diff>
--- a/exports/bhagavad-gita-turkish/bhagavad-gita.docx
+++ b/exports/bhagavad-gita-turkish/bhagavad-gita.docx
@@ -16,7 +16,7 @@
         <w:pStyle w:val="Heading1"/>
       </w:pPr>
       <w:r>
-        <w:t xml:space="preserve">Chapter 1</w:t>
+        <w:t xml:space="preserve">Chapter 1: Arjuna'nın Kederinin Yogası</w:t>
       </w:r>
     </w:p>
     <w:p>
@@ -306,7 +306,7 @@
         <w:pStyle w:val="Heading1"/>
       </w:pPr>
       <w:r>
-        <w:t xml:space="preserve">Chapter 2</w:t>
+        <w:t xml:space="preserve">Chapter 2: Bilgi Yogası</w:t>
       </w:r>
     </w:p>
     <w:p>
@@ -746,7 +746,7 @@
         <w:pStyle w:val="Heading1"/>
       </w:pPr>
       <w:r>
-        <w:t xml:space="preserve">Chapter 3</w:t>
+        <w:t xml:space="preserve">Chapter 3: Eylem Yogası</w:t>
       </w:r>
     </w:p>
     <w:p>
@@ -1012,7 +1012,7 @@
         <w:pStyle w:val="Heading1"/>
       </w:pPr>
       <w:r>
-        <w:t xml:space="preserve">Chapter 4</w:t>
+        <w:t xml:space="preserve">Chapter 4: Bilgi ve Eylemden Feragat Yogası</w:t>
       </w:r>
     </w:p>
     <w:p>
@@ -1272,7 +1272,7 @@
         <w:pStyle w:val="Heading1"/>
       </w:pPr>
       <w:r>
-        <w:t xml:space="preserve">Chapter 5</w:t>
+        <w:t xml:space="preserve">Chapter 5: Eylemden Feragat Yogası</w:t>
       </w:r>
     </w:p>
     <w:p>
@@ -1454,7 +1454,7 @@
         <w:pStyle w:val="Heading1"/>
       </w:pPr>
       <w:r>
-        <w:t xml:space="preserve">Chapter 6</w:t>
+        <w:t xml:space="preserve">Chapter 6: Meditasyon Yogası</w:t>
       </w:r>
     </w:p>
     <w:p>
@@ -1684,7 +1684,7 @@
         <w:pStyle w:val="Heading1"/>
       </w:pPr>
       <w:r>
-        <w:t xml:space="preserve">Chapter 8</w:t>
+        <w:t xml:space="preserve">Chapter 8: Ebedi Tanrı'nın Yogası</w:t>
       </w:r>
     </w:p>
     <w:p>
@@ -1860,7 +1860,7 @@
         <w:pStyle w:val="Heading1"/>
       </w:pPr>
       <w:r>
-        <w:t xml:space="preserve">Chapter 9</w:t>
+        <w:t xml:space="preserve">Chapter 9: Kraliyet Bilgisi ve Kraliyet Sırrının Yogası</w:t>
       </w:r>
     </w:p>
     <w:p>
@@ -2072,7 +2072,7 @@
         <w:pStyle w:val="Heading1"/>
       </w:pPr>
       <w:r>
-        <w:t xml:space="preserve">Chapter 10</w:t>
+        <w:t xml:space="preserve">Chapter 10: İlahi Tezahürlerin Yogası</w:t>
       </w:r>
     </w:p>
     <w:p>
@@ -2332,7 +2332,7 @@
         <w:pStyle w:val="Heading1"/>
       </w:pPr>
       <w:r>
-        <w:t xml:space="preserve">Chapter 11</w:t>
+        <w:t xml:space="preserve">Chapter 11: Evrensel Formun Görüşü Yogası</w:t>
       </w:r>
     </w:p>
     <w:p>
@@ -2670,7 +2670,7 @@
         <w:pStyle w:val="Heading1"/>
       </w:pPr>
       <w:r>
-        <w:t xml:space="preserve">Chapter 12</w:t>
+        <w:t xml:space="preserve">Chapter 12: Bhakti Yogası (Adanmışlık Yolu)</w:t>
       </w:r>
     </w:p>
     <w:p>
@@ -2798,7 +2798,7 @@
         <w:pStyle w:val="Heading1"/>
       </w:pPr>
       <w:r>
-        <w:t xml:space="preserve">Chapter 13</w:t>
+        <w:t xml:space="preserve">Chapter 13: Alan ve Alanı Bilen Arasındaki Ayrımın Yogası</w:t>
       </w:r>
     </w:p>
     <w:p>
@@ -3016,7 +3016,7 @@
         <w:pStyle w:val="Heading1"/>
       </w:pPr>
       <w:r>
-        <w:t xml:space="preserve">Chapter 14</w:t>
+        <w:t xml:space="preserve">Chapter 14: Üç Niteliğin Ayrımı Yogası</w:t>
       </w:r>
     </w:p>
     <w:p>
@@ -3186,7 +3186,7 @@
         <w:pStyle w:val="Heading1"/>
       </w:pPr>
       <w:r>
-        <w:t xml:space="preserve">Chapter 15</w:t>
+        <w:t xml:space="preserve">Chapter 15: En Yüce Kişi Yogası</w:t>
       </w:r>
     </w:p>
     <w:p>
@@ -3314,7 +3314,7 @@
         <w:pStyle w:val="Heading1"/>
       </w:pPr>
       <w:r>
-        <w:t xml:space="preserve">Chapter 16</w:t>
+        <w:t xml:space="preserve">Chapter 16: İlahi ve Şeytani Nitelikler Arasındaki Ayrım Yogası</w:t>
       </w:r>
     </w:p>
     <w:p>
@@ -3466,7 +3466,7 @@
         <w:pStyle w:val="Heading1"/>
       </w:pPr>
       <w:r>
-        <w:t xml:space="preserve">Chapter 17</w:t>
+        <w:t xml:space="preserve">Chapter 17: İmanın Üç Bölümü Yogası</w:t>
       </w:r>
     </w:p>
     <w:p>
@@ -3642,7 +3642,7 @@
         <w:pStyle w:val="Heading1"/>
       </w:pPr>
       <w:r>
-        <w:t xml:space="preserve">Chapter 18</w:t>
+        <w:t xml:space="preserve">Chapter 18: Feragat Yoluyla Kurtuluş Yogası</w:t>
       </w:r>
     </w:p>
     <w:p>

</xml_diff>

<commit_message>
chore: update binary files and README for chapter generation command
- Updated .DS_Store and SQLite database files.
- Modified README to reflect changes in chapter generation command from chapter 1 to chapter 7.
</commit_message>
<xml_diff>
--- a/exports/bhagavad-gita-turkish/bhagavad-gita.docx
+++ b/exports/bhagavad-gita-turkish/bhagavad-gita.docx
@@ -1676,6 +1676,194 @@
     <w:p>
       <w:r>
         <w:t xml:space="preserve">Ve tüm yogiler arasında, Bana inançla tapınan, iç benliği Bende absorbe olmuş olan—o Benim tarafımdan en birleşmiş olarak kabul edilir.</w:t>
+      </w:r>
+    </w:p>
+    <w:p/>
+    <w:p>
+      <w:pPr>
+        <w:pStyle w:val="Heading1"/>
+      </w:pPr>
+      <w:r>
+        <w:t xml:space="preserve">Chapter 7: Bilgi ve Hikmet Yogası</w:t>
+      </w:r>
+    </w:p>
+    <w:p>
+      <w:r>
+        <w:t xml:space="preserve">Yüce Tanrı buyurdu: Ey Partha, aklını Bana bağlayarak ve Bana sığınarak yogayı uygularken, Beni hiçbir şüphe olmaksızın tam olarak nasıl bileceğini şimdi dinle.</w:t>
+      </w:r>
+    </w:p>
+    <w:p/>
+    <w:p>
+      <w:r>
+        <w:t xml:space="preserve">Sana bu bilgiyi gerçekleşmeyle birlikte tam olarak açıklayacağım; bunu bildikten sonra bu dünyada bilinecek başka bir şey kalmaz.</w:t>
+      </w:r>
+    </w:p>
+    <w:p/>
+    <w:p>
+      <w:r>
+        <w:t xml:space="preserve">Binlerce insan arasında, ancak biri mükemmellik için çabalar; ve çabalayıp mükemmelliğe ulaşanlar arasında da ancak biri Beni gerçekte olduğum gibi bilir.</w:t>
+      </w:r>
+    </w:p>
+    <w:p/>
+    <w:p>
+      <w:r>
+        <w:t xml:space="preserve">Toprak, su, ateş, hava, ether, zihin, akıl ve ego—bunlar Benim maddi doğamın (prakriti) sekiz bölümüdür.</w:t>
+      </w:r>
+    </w:p>
+    <w:p/>
+    <w:p>
+      <w:r>
+        <w:t xml:space="preserve">Bu Benim aşağı doğamdır. Ama bil ey güçlü kollu, Benim diğer, yüksek doğamumu (para prakriti)—bu evrenin sürdürüldüğü yaşam gücünü.</w:t>
+      </w:r>
+    </w:p>
+    <w:p/>
+    <w:p>
+      <w:r>
+        <w:t xml:space="preserve">Tüm varlıkların Benim bu iki doğamdan kaynaklandığını bil. Ben tüm evrenin kaynağıyım ve aynı zamanda onun çözülüşüyüm.</w:t>
+      </w:r>
+    </w:p>
+    <w:p/>
+    <w:p>
+      <w:r>
+        <w:t xml:space="preserve">Benden daha yüksek hiçbir şey yoktur, ey Dhananjaya. Tüm bu evren, bir ipteki inciler gibi Bana dizilmiştir.</w:t>
+      </w:r>
+    </w:p>
+    <w:p/>
+    <w:p>
+      <w:r>
+        <w:t xml:space="preserve">Ey Kunti oğlu, Ben sudaki tattır, ay ve güneşteki ışığım, tüm Vedalardaki kutsal Om hecesiyim, uzaydaki sesim ve erkeklerdeki erkekliğim.</w:t>
+      </w:r>
+    </w:p>
+    <w:p/>
+    <w:p>
+      <w:r>
+        <w:t xml:space="preserve">Ben topraktaki saf kokuyum ve ateşteki parlaklığım; tüm varlıklardaki yaşamım ve çilecilerdeki çilecilik.</w:t>
+      </w:r>
+    </w:p>
+    <w:p/>
+    <w:p>
+      <w:r>
+        <w:t xml:space="preserve">Beni, ey Partha, tüm varlıkların ebedi tohumu olarak bil. Ben akıllıların aklıyım ve görkemli olanların görkemiyim.</w:t>
+      </w:r>
+    </w:p>
+    <w:p/>
+    <w:p>
+      <w:r>
+        <w:t xml:space="preserve">Ben güçlülerin arzu ve bağlantıdan arınmış gücüyüm. Varlıklarda, dharmaya aykırı olmayan o arzuyum, ey Bharata'ların en iyisi.</w:t>
+      </w:r>
+    </w:p>
+    <w:p/>
+    <w:p>
+      <w:r>
+        <w:t xml:space="preserve">İyilik, tutku veya cehalet kipinde olsun tüm varoluş hallerinin yalnızca Benden kaynaklandığını bil. Yine de Ben onların içinde değilim; onlar Benim içimdedir.</w:t>
+      </w:r>
+    </w:p>
+    <w:p/>
+    <w:p>
+      <w:r>
+        <w:t xml:space="preserve">Bu üç kip (gunalar) tarafından aldatılan tüm dünya, onların ötesinde ve yok edilemez olan Beni tanımıyor.</w:t>
+      </w:r>
+    </w:p>
+    <w:p/>
+    <w:p>
+      <w:r>
+        <w:t xml:space="preserve">Benim üç gunadan oluşan bu ilahi Maya'm aşılması zordur. Ancak yalnızca Bana teslim olanlar bu yanılsamayı kolayca aşabilir.</w:t>
+      </w:r>
+    </w:p>
+    <w:p/>
+    <w:p>
+      <w:r>
+        <w:t xml:space="preserve">Kötülük yapan ahmaklar, insanların en alçakları, Maya tarafından bilgiden yoksun bırakılmış ve şeytani bir doğaya sahip olanlar Bana teslim olmazlar.</w:t>
+      </w:r>
+    </w:p>
+    <w:p/>
+    <w:p>
+      <w:r>
+        <w:t xml:space="preserve">Dört tür erdemli insan Bana ibadet eder, ey Arjuna: sıkıntılı olan, bilgi arayan, zenginlik arayan ve bilge olan, ey Bharata'ların en iyisi.</w:t>
+      </w:r>
+    </w:p>
+    <w:p/>
+    <w:p>
+      <w:r>
+        <w:t xml:space="preserve">Bunlar arasında, tek yönlü adanmışlıkla sürekli Benimle birleşen bilge en iyisidir. Çünkü Ben bilge için son derece değerliyim ve o da Benim için değerlidir.</w:t>
+      </w:r>
+    </w:p>
+    <w:p/>
+    <w:p>
+      <w:r>
+        <w:t xml:space="preserve">Bunların hepsi gerçekten asil, ancak bilge olanı Kendi Benliğim olarak görürüm. Çünkü böyle bir kişi, zihni kararlı, yalnızca Bende üstün amaç olarak yerleşmiştir.</w:t>
+      </w:r>
+    </w:p>
+    <w:p/>
+    <w:p>
+      <w:r>
+        <w:t xml:space="preserve">Birçok doğumun sonunda, bilgiyle donanmış kişi Vasudeva'nın (Krishna) her şey olduğunu bilerek Bana teslim olur. Böyle bir yüce ruh çok nadirdir.</w:t>
+      </w:r>
+    </w:p>
+    <w:p/>
+    <w:p>
+      <w:r>
+        <w:t xml:space="preserve">Çeşitli arzular tarafından bilgeliği götürülmüş olanlar, kendi doğaları tarafından yönlendirilerek belirli kural ve düzenlemeleri izleyerek diğer tanrılara teslim olurlar.</w:t>
+      </w:r>
+    </w:p>
+    <w:p/>
+    <w:p>
+      <w:r>
+        <w:t xml:space="preserve">Bir adanmış hangi biçime imanla ibadet etmek isterse, onların imanını sağlam ve sarsılmaz kılarım.</w:t>
+      </w:r>
+    </w:p>
+    <w:p/>
+    <w:p>
+      <w:r>
+        <w:t xml:space="preserve">O imanla donanmış olarak, o tanrıya ibadet etmeye çalışır ve arzularını elde eder. Ancak gerçekte, o nimetleri veren yalnızca Benim.</w:t>
+      </w:r>
+    </w:p>
+    <w:p/>
+    <w:p>
+      <w:r>
+        <w:t xml:space="preserve">Ancak bu küçük anlayışlı insanların elde ettiği meyveler geçicidir. Tanrılara tapanlar tanrılara gider, ama Benim adanmışlarım Bana gelir.</w:t>
+      </w:r>
+    </w:p>
+    <w:p/>
+    <w:p>
+      <w:r>
+        <w:t xml:space="preserve">Akılsızlar, tezahür etmemiş olan Benim tezahür etmiş bir biçim aldığımı sanır, Benim yok edilemez ve aşılamaz üstün doğamı bilmez.</w:t>
+      </w:r>
+    </w:p>
+    <w:p/>
+    <w:p>
+      <w:r>
+        <w:t xml:space="preserve">Yoga-Maya'm tarafından örtülü olarak, herkese açık değilim. Bu aldatılmış dünya, Beni doğmamış ve yok edilemez olarak tanımıyor.</w:t>
+      </w:r>
+    </w:p>
+    <w:p/>
+    <w:p>
+      <w:r>
+        <w:t xml:space="preserve">Geçmişin, şimdinin ve geleceğin tüm varlıklarını bilirim, ey Arjuna, ancak hiç kimse Beni bilmez.</w:t>
+      </w:r>
+    </w:p>
+    <w:p/>
+    <w:p>
+      <w:r>
+        <w:t xml:space="preserve">Ey Bharata soyundan gelen, tüm varlıklar yanılsamaya doğar, çekim ve itimden kaynaklanan arzu ve nefretin ikiliği tarafından şaşkına döner, ey düşmanların fatihi.</w:t>
+      </w:r>
+    </w:p>
+    <w:p/>
+    <w:p>
+      <w:r>
+        <w:t xml:space="preserve">Ancak erdemli eylemler yapan, günahları sona ermiş, ikilik yanılsamasından kurtulmuş kişiler, kararlı bir şekilde Bana ibadet ederler.</w:t>
+      </w:r>
+    </w:p>
+    <w:p/>
+    <w:p>
+      <w:r>
+        <w:t xml:space="preserve">Yaşlılık ve ölümden kurtuluş için Bana sığınan ve çabalayanlara Brahman'ı tam olarak, Benlik'le ve tüm karma ile birlikte bilirler.</w:t>
+      </w:r>
+    </w:p>
+    <w:p/>
+    <w:p>
+      <w:r>
+        <w:t xml:space="preserve">Fiziksel alanın, göksel alanın ve kurbanın yöneten ilkesi olarak Beni bilenler, zihinleri kararlı olanlar, ölüm anında bile Beni bilirler.</w:t>
       </w:r>
     </w:p>
     <w:p/>

</xml_diff>